<commit_message>
Audios editados y agregados
</commit_message>
<xml_diff>
--- a/Guíon HorrorTape.docx
+++ b/Guíon HorrorTape.docx
@@ -369,7 +369,7 @@
     <w:p>
       <w:r>
         <w:pict w14:anchorId="46EF6F5C">
-          <v:rect id="_x0000_i1049" style="width:0;height:1.5pt" o:hralign="center" o:hrstd="t" o:hr="t" fillcolor="#a0a0a0" stroked="f"/>
+          <v:rect id="_x0000_i1025" style="width:0;height:1.5pt" o:hralign="center" o:hrstd="t" o:hr="t" fillcolor="#a0a0a0" stroked="f"/>
         </w:pict>
       </w:r>
     </w:p>
@@ -451,7 +451,7 @@
     <w:p>
       <w:r>
         <w:pict w14:anchorId="6A900A0A">
-          <v:rect id="_x0000_i1050" style="width:0;height:1.5pt" o:hralign="center" o:hrstd="t" o:hr="t" fillcolor="#a0a0a0" stroked="f"/>
+          <v:rect id="_x0000_i1026" style="width:0;height:1.5pt" o:hralign="center" o:hrstd="t" o:hr="t" fillcolor="#a0a0a0" stroked="f"/>
         </w:pict>
       </w:r>
     </w:p>
@@ -538,7 +538,7 @@
     <w:p>
       <w:r>
         <w:pict w14:anchorId="32DE17DF">
-          <v:rect id="_x0000_i1051" style="width:0;height:1.5pt" o:hralign="center" o:hrstd="t" o:hr="t" fillcolor="#a0a0a0" stroked="f"/>
+          <v:rect id="_x0000_i1027" style="width:0;height:1.5pt" o:hralign="center" o:hrstd="t" o:hr="t" fillcolor="#a0a0a0" stroked="f"/>
         </w:pict>
       </w:r>
     </w:p>
@@ -627,7 +627,7 @@
     <w:p>
       <w:r>
         <w:pict w14:anchorId="0D46919E">
-          <v:rect id="_x0000_i1052" style="width:0;height:1.5pt" o:hralign="center" o:hrstd="t" o:hr="t" fillcolor="#a0a0a0" stroked="f"/>
+          <v:rect id="_x0000_i1028" style="width:0;height:1.5pt" o:hralign="center" o:hrstd="t" o:hr="t" fillcolor="#a0a0a0" stroked="f"/>
         </w:pict>
       </w:r>
     </w:p>
@@ -803,6 +803,31 @@
       </w:r>
     </w:p>
     <w:p/>
+    <w:p>
+      <w:r>
+        <w:t>Audio Oficial</w:t>
+      </w:r>
+      <w:r>
+        <w:br/>
+        <w:t xml:space="preserve">Audio Jorge 1 </w:t>
+      </w:r>
+      <w:r>
+        <w:br/>
+        <w:t>Asesino (4)</w:t>
+      </w:r>
+      <w:r>
+        <w:br/>
+        <w:t xml:space="preserve">Asesino turbio (7) </w:t>
+      </w:r>
+      <w:r>
+        <w:br/>
+        <w:t>- Audio Fantasma mientras estás encerrado</w:t>
+      </w:r>
+      <w:r>
+        <w:br/>
+        <w:t>Audio Final Jorge  (3-9)</w:t>
+      </w:r>
+    </w:p>
     <w:sectPr>
       <w:pgSz w:w="11906" w:h="16838"/>
       <w:pgMar w:top="1417" w:right="1701" w:bottom="1417" w:left="1701" w:header="708" w:footer="708" w:gutter="0"/>
@@ -1379,6 +1404,7 @@
   <w:style w:type="character" w:default="1" w:styleId="Fuentedeprrafopredeter">
     <w:name w:val="Default Paragraph Font"/>
     <w:uiPriority w:val="1"/>
+    <w:semiHidden/>
     <w:unhideWhenUsed/>
   </w:style>
   <w:style w:type="table" w:default="1" w:styleId="Tablanormal">

</xml_diff>